<commit_message>
FSD v0.5 docx: opmaak hersteld via pandoc standaard stijlen
Co-Authored-By: Claude Sonnet 4.6 <noreply@anthropic.com>
</commit_message>
<xml_diff>
--- a/docs/FSD_LoRa_tuinmeetnet_v0_5.docx
+++ b/docs/FSD_LoRa_tuinmeetnet_v0_5.docx
@@ -11703,14 +11703,7 @@
     </w:p>
     <w:bookmarkEnd w:id="60"/>
     <w:bookmarkEnd w:id="61"/>
-    <w:sectPr>
-      <w:type w:val="nextPage"/>
-      <w:pgSz w:h="16838" w:w="11906"/>
-      <w:pgMar w:bottom="1134" w:footer="0" w:gutter="0" w:header="0" w:left="1134" w:right="1134" w:top="1134"/>
-      <w:pgNumType w:fmt="decimal"/>
-      <w:formProt w:val="false"/>
-      <w:textDirection w:val="lrTb"/>
-    </w:sectPr>
+    <w:sectPr/>
   </w:body>
 </w:document>
 </file>
@@ -12170,106 +12163,489 @@
 </file>
 
 <file path=word/styles.xml><?xml version="1.0" encoding="utf-8"?>
-<w:styles xmlns:mc="http://schemas.openxmlformats.org/markup-compatibility/2006" xmlns:w="http://schemas.openxmlformats.org/wordprocessingml/2006/main" xmlns:w14="http://schemas.microsoft.com/office/word/2010/wordml" mc:Ignorable="w14">
+<w:styles xmlns:r="http://schemas.openxmlformats.org/officeDocument/2006/relationships" xmlns:w="http://schemas.openxmlformats.org/wordprocessingml/2006/main">
   <w:docDefaults>
     <w:rPrDefault>
       <w:rPr>
-        <w:rFonts w:ascii="Liberation Serif" w:cs="Noto Sans Devanagari" w:eastAsia="Noto Serif CJK SC" w:hAnsi="Liberation Serif"/>
+        <w:rFonts w:asciiTheme="minorHAnsi" w:cstheme="minorBidi" w:eastAsiaTheme="minorHAnsi" w:hAnsiTheme="minorHAnsi"/>
         <w:sz w:val="24"/>
         <w:szCs w:val="24"/>
-        <w:lang w:bidi="hi-IN" w:eastAsia="zh-CN" w:val="en-US"/>
+        <w:lang w:bidi="ar-SA" w:eastAsia="en-US" w:val="en-US"/>
       </w:rPr>
     </w:rPrDefault>
     <w:pPrDefault>
       <w:pPr>
-        <w:suppressAutoHyphens w:val="true"/>
+        <w:spacing w:after="200"/>
       </w:pPr>
     </w:pPrDefault>
   </w:docDefaults>
-  <w:style w:styleId="Normal" w:type="paragraph">
+  <w:latentStyles w:count="276" w:defLockedState="0" w:defQFormat="0" w:defSemiHidden="0" w:defUIPriority="0" w:defUnhideWhenUsed="0"/>
+  <w:style w:default="1" w:styleId="Normal" w:type="paragraph">
     <w:name w:val="Normal"/>
     <w:qFormat/>
+  </w:style>
+  <w:style w:styleId="BodyText" w:type="paragraph">
+    <w:name w:val="Body Text"/>
+    <w:basedOn w:val="Normal"/>
+    <w:link w:val="BodyTextChar"/>
     <w:pPr>
-      <w:widowControl w:val="false"/>
-      <w:bidi w:val="0"/>
+      <w:spacing w:after="180" w:before="180"/>
     </w:pPr>
-    <w:rPr>
-      <w:rFonts w:ascii="Liberation Serif" w:cs="Noto Sans Devanagari" w:eastAsia="Noto Serif CJK SC" w:hAnsi="Liberation Serif"/>
-      <w:color w:val="auto"/>
-      <w:sz w:val="24"/>
-      <w:szCs w:val="24"/>
-      <w:lang w:bidi="hi-IN" w:eastAsia="zh-CN" w:val="en-US"/>
-    </w:rPr>
+    <w:qFormat/>
   </w:style>
-  <w:style w:styleId="Heading" w:type="paragraph">
-    <w:name w:val="Heading"/>
+  <w:style w:customStyle="1" w:styleId="FirstParagraph" w:type="paragraph">
+    <w:name w:val="First Paragraph"/>
+    <w:basedOn w:val="BodyText"/>
+    <w:next w:val="BodyText"/>
+    <w:qFormat/>
+  </w:style>
+  <w:style w:customStyle="1" w:styleId="Compact" w:type="paragraph">
+    <w:name w:val="Compact"/>
+    <w:basedOn w:val="BodyText"/>
+    <w:qFormat/>
+    <w:pPr>
+      <w:spacing w:after="36" w:before="36"/>
+    </w:pPr>
+  </w:style>
+  <w:style w:styleId="Title" w:type="paragraph">
+    <w:name w:val="Title"/>
     <w:basedOn w:val="Normal"/>
     <w:next w:val="BodyText"/>
     <w:qFormat/>
     <w:pPr>
-      <w:keepNext w:val="true"/>
-      <w:spacing w:after="120" w:before="240"/>
+      <w:keepNext/>
+      <w:keepLines/>
+      <w:spacing w:after="240" w:before="480"/>
+      <w:jc w:val="center"/>
     </w:pPr>
     <w:rPr>
-      <w:rFonts w:ascii="Liberation Sans" w:cs="Noto Sans Devanagari" w:eastAsia="Noto Sans CJK SC" w:hAnsi="Liberation Sans"/>
+      <w:rFonts w:asciiTheme="majorHAnsi" w:cstheme="majorBidi" w:eastAsiaTheme="majorEastAsia" w:hAnsiTheme="majorHAnsi"/>
+      <w:b/>
+      <w:bCs/>
+      <w:color w:themeColor="accent1" w:themeShade="B5" w:val="345A8A"/>
+      <w:sz w:val="36"/>
+      <w:szCs w:val="36"/>
+    </w:rPr>
+  </w:style>
+  <w:style w:styleId="Subtitle" w:type="paragraph">
+    <w:name w:val="Subtitle"/>
+    <w:basedOn w:val="Title"/>
+    <w:next w:val="BodyText"/>
+    <w:qFormat/>
+    <w:pPr>
+      <w:keepNext/>
+      <w:keepLines/>
+      <w:spacing w:after="240" w:before="240"/>
+      <w:jc w:val="center"/>
+    </w:pPr>
+    <w:rPr>
+      <w:sz w:val="30"/>
+      <w:szCs w:val="30"/>
+    </w:rPr>
+  </w:style>
+  <w:style w:customStyle="1" w:styleId="Author" w:type="paragraph">
+    <w:name w:val="Author"/>
+    <w:next w:val="BodyText"/>
+    <w:qFormat/>
+    <w:pPr>
+      <w:keepNext/>
+      <w:keepLines/>
+      <w:jc w:val="center"/>
+    </w:pPr>
+  </w:style>
+  <w:style w:styleId="Date" w:type="paragraph">
+    <w:name w:val="Date"/>
+    <w:next w:val="BodyText"/>
+    <w:qFormat/>
+    <w:pPr>
+      <w:keepNext/>
+      <w:keepLines/>
+      <w:jc w:val="center"/>
+    </w:pPr>
+  </w:style>
+  <w:style w:customStyle="1" w:styleId="AbstractTitle" w:type="paragraph">
+    <w:name w:val="Abstract Title"/>
+    <w:basedOn w:val="Normal"/>
+    <w:next w:val="Abstract"/>
+    <w:qFormat/>
+    <w:pPr>
+      <w:keepNext/>
+      <w:keepLines/>
+      <w:jc w:val="center"/>
+      <w:spacing w:after="0" w:before="300"/>
+    </w:pPr>
+    <w:rPr>
+      <w:sz w:val="20"/>
+      <w:szCs w:val="20"/>
+      <w:b/>
+      <w:color w:val="345A8A"/>
+      &gt;
+    </w:rPr>
+  </w:style>
+  <w:style w:customStyle="1" w:styleId="Abstract" w:type="paragraph">
+    <w:name w:val="Abstract"/>
+    <w:basedOn w:val="Normal"/>
+    <w:next w:val="BodyText"/>
+    <w:qFormat/>
+    <w:pPr>
+      <w:keepNext/>
+      <w:keepLines/>
+      <w:spacing w:after="300" w:before="100"/>
+    </w:pPr>
+    <w:rPr>
+      <w:sz w:val="20"/>
+      <w:szCs w:val="20"/>
+    </w:rPr>
+  </w:style>
+  <w:style w:styleId="Bibliography" w:type="paragraph">
+    <w:name w:val="Bibliography"/>
+    <w:basedOn w:val="Normal"/>
+    <w:next w:val="Bibliography"/>
+    <w:qFormat/>
+    <w:pPr/>
+    <w:rPr/>
+  </w:style>
+  <w:style w:styleId="Heading1" w:type="paragraph">
+    <w:name w:val="Heading 1"/>
+    <w:basedOn w:val="Normal"/>
+    <w:next w:val="BodyText"/>
+    <w:uiPriority w:val="9"/>
+    <w:qFormat/>
+    <w:pPr>
+      <w:keepNext/>
+      <w:keepLines/>
+      <w:spacing w:after="0" w:before="480"/>
+      <w:outlineLvl w:val="0"/>
+    </w:pPr>
+    <w:rPr>
+      <w:rFonts w:asciiTheme="majorHAnsi" w:cstheme="majorBidi" w:eastAsiaTheme="majorEastAsia" w:hAnsiTheme="majorHAnsi"/>
+      <w:b/>
+      <w:bCs/>
+      <w:color w:themeColor="accent1" w:val="4F81BD"/>
+      <w:sz w:val="32"/>
+      <w:szCs w:val="32"/>
+    </w:rPr>
+  </w:style>
+  <w:style w:styleId="Heading2" w:type="paragraph">
+    <w:name w:val="Heading 2"/>
+    <w:basedOn w:val="Normal"/>
+    <w:next w:val="BodyText"/>
+    <w:uiPriority w:val="9"/>
+    <w:unhideWhenUsed/>
+    <w:qFormat/>
+    <w:pPr>
+      <w:keepNext/>
+      <w:keepLines/>
+      <w:spacing w:after="0" w:before="200"/>
+      <w:outlineLvl w:val="1"/>
+    </w:pPr>
+    <w:rPr>
+      <w:rFonts w:asciiTheme="majorHAnsi" w:cstheme="majorBidi" w:eastAsiaTheme="majorEastAsia" w:hAnsiTheme="majorHAnsi"/>
+      <w:b/>
+      <w:bCs/>
+      <w:color w:themeColor="accent1" w:val="4F81BD"/>
       <w:sz w:val="28"/>
       <w:szCs w:val="28"/>
     </w:rPr>
   </w:style>
-  <w:style w:styleId="BodyText" w:type="paragraph">
-    <w:name w:val="Body Text"/>
+  <w:style w:styleId="Heading3" w:type="paragraph">
+    <w:name w:val="Heading 3"/>
     <w:basedOn w:val="Normal"/>
+    <w:next w:val="BodyText"/>
+    <w:uiPriority w:val="9"/>
+    <w:unhideWhenUsed/>
+    <w:qFormat/>
     <w:pPr>
-      <w:spacing w:after="140" w:before="0" w:line="276" w:lineRule="auto"/>
+      <w:keepNext/>
+      <w:keepLines/>
+      <w:spacing w:after="0" w:before="200"/>
+      <w:outlineLvl w:val="2"/>
     </w:pPr>
-    <w:rPr/>
+    <w:rPr>
+      <w:rFonts w:asciiTheme="majorHAnsi" w:cstheme="majorBidi" w:eastAsiaTheme="majorEastAsia" w:hAnsiTheme="majorHAnsi"/>
+      <w:b/>
+      <w:bCs/>
+      <w:color w:themeColor="accent1" w:val="4F81BD"/>
+      <w:sz w:val="24"/>
+      <w:szCs w:val="24"/>
+    </w:rPr>
   </w:style>
-  <w:style w:styleId="List" w:type="paragraph">
-    <w:name w:val="List"/>
+  <w:style w:styleId="Heading4" w:type="paragraph">
+    <w:name w:val="Heading 4"/>
+    <w:basedOn w:val="Normal"/>
+    <w:next w:val="BodyText"/>
+    <w:uiPriority w:val="9"/>
+    <w:unhideWhenUsed/>
+    <w:qFormat/>
+    <w:pPr>
+      <w:keepNext/>
+      <w:keepLines/>
+      <w:spacing w:after="0" w:before="200"/>
+      <w:outlineLvl w:val="3"/>
+    </w:pPr>
+    <w:rPr>
+      <w:rFonts w:asciiTheme="majorHAnsi" w:cstheme="majorBidi" w:eastAsiaTheme="majorEastAsia" w:hAnsiTheme="majorHAnsi"/>
+      <w:i/>
+      <w:bCs/>
+      <w:color w:themeColor="accent1" w:val="4F81BD"/>
+      <w:sz w:val="24"/>
+      <w:szCs w:val="24"/>
+    </w:rPr>
+  </w:style>
+  <w:style w:styleId="Heading5" w:type="paragraph">
+    <w:name w:val="Heading 5"/>
+    <w:basedOn w:val="Normal"/>
+    <w:next w:val="BodyText"/>
+    <w:uiPriority w:val="9"/>
+    <w:unhideWhenUsed/>
+    <w:qFormat/>
+    <w:pPr>
+      <w:keepNext/>
+      <w:keepLines/>
+      <w:spacing w:after="0" w:before="200"/>
+      <w:outlineLvl w:val="4"/>
+    </w:pPr>
+    <w:rPr>
+      <w:rFonts w:asciiTheme="majorHAnsi" w:cstheme="majorBidi" w:eastAsiaTheme="majorEastAsia" w:hAnsiTheme="majorHAnsi"/>
+      <w:iCs/>
+      <w:color w:themeColor="accent1" w:val="4F81BD"/>
+      <w:sz w:val="24"/>
+      <w:szCs w:val="24"/>
+    </w:rPr>
+  </w:style>
+  <w:style w:styleId="Heading6" w:type="paragraph">
+    <w:name w:val="Heading 6"/>
+    <w:basedOn w:val="Normal"/>
+    <w:next w:val="BodyText"/>
+    <w:uiPriority w:val="9"/>
+    <w:unhideWhenUsed/>
+    <w:qFormat/>
+    <w:pPr>
+      <w:keepNext/>
+      <w:keepLines/>
+      <w:spacing w:after="0" w:before="200"/>
+      <w:outlineLvl w:val="5"/>
+    </w:pPr>
+    <w:rPr>
+      <w:rFonts w:asciiTheme="majorHAnsi" w:cstheme="majorBidi" w:eastAsiaTheme="majorEastAsia" w:hAnsiTheme="majorHAnsi"/>
+      <w:color w:themeColor="accent1" w:val="4F81BD"/>
+      <w:sz w:val="24"/>
+      <w:szCs w:val="24"/>
+    </w:rPr>
+  </w:style>
+  <w:style w:styleId="Heading7" w:type="paragraph">
+    <w:name w:val="Heading 7"/>
+    <w:basedOn w:val="Normal"/>
+    <w:next w:val="BodyText"/>
+    <w:uiPriority w:val="9"/>
+    <w:unhideWhenUsed/>
+    <w:qFormat/>
+    <w:pPr>
+      <w:keepNext/>
+      <w:keepLines/>
+      <w:spacing w:after="0" w:before="200"/>
+      <w:outlineLvl w:val="6"/>
+    </w:pPr>
+    <w:rPr>
+      <w:rFonts w:asciiTheme="majorHAnsi" w:cstheme="majorBidi" w:eastAsiaTheme="majorEastAsia" w:hAnsiTheme="majorHAnsi"/>
+      <w:color w:themeColor="accent1" w:val="4F81BD"/>
+      <w:sz w:val="24"/>
+      <w:szCs w:val="24"/>
+    </w:rPr>
+  </w:style>
+  <w:style w:styleId="Heading8" w:type="paragraph">
+    <w:name w:val="Heading 8"/>
+    <w:basedOn w:val="Normal"/>
+    <w:next w:val="BodyText"/>
+    <w:uiPriority w:val="9"/>
+    <w:unhideWhenUsed/>
+    <w:qFormat/>
+    <w:pPr>
+      <w:keepNext/>
+      <w:keepLines/>
+      <w:spacing w:after="0" w:before="200"/>
+      <w:outlineLvl w:val="7"/>
+    </w:pPr>
+    <w:rPr>
+      <w:rFonts w:asciiTheme="majorHAnsi" w:cstheme="majorBidi" w:eastAsiaTheme="majorEastAsia" w:hAnsiTheme="majorHAnsi"/>
+      <w:color w:themeColor="accent1" w:val="4F81BD"/>
+      <w:sz w:val="24"/>
+      <w:szCs w:val="24"/>
+    </w:rPr>
+  </w:style>
+  <w:style w:styleId="Heading9" w:type="paragraph">
+    <w:name w:val="Heading 9"/>
+    <w:basedOn w:val="Normal"/>
+    <w:next w:val="BodyText"/>
+    <w:uiPriority w:val="9"/>
+    <w:unhideWhenUsed/>
+    <w:qFormat/>
+    <w:pPr>
+      <w:keepNext/>
+      <w:keepLines/>
+      <w:spacing w:after="0" w:before="200"/>
+      <w:outlineLvl w:val="8"/>
+    </w:pPr>
+    <w:rPr>
+      <w:rFonts w:asciiTheme="majorHAnsi" w:cstheme="majorBidi" w:eastAsiaTheme="majorEastAsia" w:hAnsiTheme="majorHAnsi"/>
+      <w:color w:themeColor="accent1" w:val="4F81BD"/>
+      <w:sz w:val="24"/>
+      <w:szCs w:val="24"/>
+    </w:rPr>
+  </w:style>
+  <w:style w:styleId="BlockText" w:type="paragraph">
+    <w:name w:val="Block Text"/>
     <w:basedOn w:val="BodyText"/>
-    <w:pPr/>
+    <w:next w:val="BodyText"/>
+    <w:uiPriority w:val="9"/>
+    <w:unhideWhenUsed/>
+    <w:qFormat/>
+    <w:pPr>
+      <w:spacing w:after="100" w:before="100"/>
+      <w:ind w:firstLine="0" w:left="480" w:right="480"/>
+    </w:pPr>
+  </w:style>
+  <w:style w:styleId="FootnoteText" w:type="paragraph">
+    <w:name w:val="Footnote Text"/>
+    <w:basedOn w:val="Normal"/>
+    <w:next w:val="FootnoteText"/>
+    <w:uiPriority w:val="9"/>
+    <w:unhideWhenUsed/>
+    <w:qFormat/>
+  </w:style>
+  <w:style w:default="1" w:styleId="DefaultParagraphFont" w:type="character">
+    <w:name w:val="Default Paragraph Font"/>
+    <w:semiHidden/>
+    <w:unhideWhenUsed/>
+  </w:style>
+  <w:style w:default="1" w:styleId="Table" w:type="table">
+    <w:name w:val="Table"/>
+    <w:basedOn w:val="TableNormal"/>
+    <w:semiHidden/>
+    <w:unhideWhenUsed/>
+    <w:qFormat/>
+    <w:tblPr>
+      <w:tblInd w:type="dxa" w:w="0"/>
+      <w:tblCellMar>
+        <w:top w:type="dxa" w:w="0"/>
+        <w:left w:type="dxa" w:w="108"/>
+        <w:bottom w:type="dxa" w:w="0"/>
+        <w:right w:type="dxa" w:w="108"/>
+      </w:tblCellMar>
+    </w:tblPr>
+    <w:tblStylePr w:type="firstRow">
+      <w:tblPr>
+        <w:jc w:val="left"/>
+        <w:tblInd w:type="dxa" w:w="0"/>
+      </w:tblPr>
+      <w:trPr>
+        <w:jc w:val="left"/>
+      </w:trPr>
+      <w:tcPr>
+        <w:vAlign w:val="bottom"/>
+        <w:tcBorders>
+          <w:bottom w:val="single"/>
+        </w:tcBorders>
+      </w:tcPr>
+    </w:tblStylePr>
+  </w:style>
+  <w:style w:customStyle="1" w:styleId="DefinitionTerm" w:type="paragraph">
+    <w:name w:val="Definition Term"/>
+    <w:basedOn w:val="Normal"/>
+    <w:next w:val="Definition"/>
+    <w:pPr>
+      <w:keepNext/>
+      <w:keepLines/>
+      <w:spacing w:after="0"/>
+    </w:pPr>
     <w:rPr>
-      <w:rFonts w:cs="Noto Sans Devanagari"/>
+      <w:b/>
     </w:rPr>
+  </w:style>
+  <w:style w:customStyle="1" w:styleId="Definition" w:type="paragraph">
+    <w:name w:val="Definition"/>
+    <w:basedOn w:val="Normal"/>
   </w:style>
   <w:style w:styleId="Caption" w:type="paragraph">
     <w:name w:val="Caption"/>
     <w:basedOn w:val="Normal"/>
+    <w:link w:val="BodyTextChar"/>
+    <w:pPr>
+      <w:spacing w:after="120" w:before="0"/>
+    </w:pPr>
+    <w:rPr>
+      <w:i/>
+    </w:rPr>
+  </w:style>
+  <w:style w:customStyle="1" w:styleId="TableCaption" w:type="paragraph">
+    <w:name w:val="Table Caption"/>
+    <w:basedOn w:val="Caption"/>
+    <w:pPr>
+      <w:keepNext/>
+    </w:pPr>
+  </w:style>
+  <w:style w:customStyle="1" w:styleId="ImageCaption" w:type="paragraph">
+    <w:name w:val="Image Caption"/>
+    <w:basedOn w:val="Caption"/>
+  </w:style>
+  <w:style w:customStyle="1" w:styleId="Figure" w:type="paragraph">
+    <w:name w:val="Figure"/>
+    <w:basedOn w:val="Normal"/>
+  </w:style>
+  <w:style w:customStyle="1" w:styleId="CaptionedFigure" w:type="paragraph">
+    <w:name w:val="Captioned Figure"/>
+    <w:basedOn w:val="Figure"/>
+    <w:pPr>
+      <w:keepNext/>
+    </w:pPr>
+  </w:style>
+  <w:style w:customStyle="1" w:styleId="BodyTextChar" w:type="character">
+    <w:name w:val="Body Text Char"/>
+    <w:basedOn w:val="DefaultParagraphFont"/>
+    <w:link w:val="BodyText"/>
+  </w:style>
+  <w:style w:customStyle="1" w:styleId="VerbatimChar" w:type="character">
+    <w:name w:val="Verbatim Char"/>
+    <w:basedOn w:val="BodyTextChar"/>
+    <w:rPr>
+      <w:rFonts w:ascii="Consolas" w:hAnsi="Consolas"/>
+      <w:sz w:val="22"/>
+    </w:rPr>
+  </w:style>
+  <w:style w:customStyle="1" w:styleId="SectionNumber" w:type="character">
+    <w:name w:val="Section Number"/>
+    <w:basedOn w:val="BodyTextChar"/>
+  </w:style>
+  <w:style w:styleId="FootnoteReference" w:type="character">
+    <w:name w:val="Footnote Reference"/>
+    <w:basedOn w:val="BodyTextChar"/>
+    <w:rPr>
+      <w:vertAlign w:val="superscript"/>
+    </w:rPr>
+  </w:style>
+  <w:style w:styleId="Hyperlink" w:type="character">
+    <w:name w:val="Hyperlink"/>
+    <w:basedOn w:val="BodyTextChar"/>
+    <w:rPr>
+      <w:color w:themeColor="accent1" w:val="4F81BD"/>
+    </w:rPr>
+  </w:style>
+  <w:style w:styleId="TOCHeading" w:type="paragraph">
+    <w:name w:val="TOC Heading"/>
+    <w:basedOn w:val="Heading1"/>
+    <w:next w:val="BodyText"/>
+    <w:uiPriority w:val="39"/>
+    <w:unhideWhenUsed/>
     <w:qFormat/>
     <w:pPr>
-      <w:suppressLineNumbers/>
-      <w:spacing w:after="120" w:before="120"/>
+      <w:spacing w:before="240" w:line="259" w:lineRule="auto"/>
+      <w:outlineLvl w:val="9"/>
     </w:pPr>
     <w:rPr>
-      <w:rFonts w:cs="Noto Sans Devanagari"/>
-      <w:i/>
-      <w:iCs/>
-      <w:sz w:val="24"/>
-      <w:szCs w:val="24"/>
-    </w:rPr>
-  </w:style>
-  <w:style w:styleId="Index" w:type="paragraph">
-    <w:name w:val="Index"/>
-    <w:basedOn w:val="Normal"/>
-    <w:qFormat/>
-    <w:pPr>
-      <w:suppressLineNumbers/>
-    </w:pPr>
-    <w:rPr>
-      <w:rFonts w:cs="Noto Sans Devanagari"/>
-    </w:rPr>
-  </w:style>
-  <w:style w:styleId="PreformattedText" w:type="paragraph">
-    <w:name w:val="Preformatted Text"/>
-    <w:basedOn w:val="Normal"/>
-    <w:qFormat/>
-    <w:pPr>
-      <w:spacing w:after="0" w:before="0"/>
-    </w:pPr>
-    <w:rPr>
-      <w:rFonts w:ascii="Liberation Mono" w:cs="Liberation Mono" w:eastAsia="Noto Sans Mono CJK SC" w:hAnsi="Liberation Mono"/>
-      <w:sz w:val="20"/>
-      <w:szCs w:val="20"/>
+      <w:rFonts w:asciiTheme="majorHAnsi" w:cstheme="majorBidi" w:eastAsiaTheme="majorEastAsia" w:hAnsiTheme="majorHAnsi"/>
+      <w:b w:val="0"/>
+      <w:bCs w:val="0"/>
+      <w:color w:themeColor="accent1" w:themeShade="BF" w:val="365F91"/>
     </w:rPr>
   </w:style>
   <w:style w:type="paragraph" w:customStyle="1" w:styleId="SourceCode">
@@ -12510,107 +12886,319 @@
 </file>
 
 <file path=word/theme/theme1.xml><?xml version="1.0" encoding="utf-8"?>
-<a:theme xmlns:a="http://schemas.openxmlformats.org/drawingml/2006/main" xmlns:r="http://schemas.openxmlformats.org/officeDocument/2006/relationships" name="Office">
+<a:theme xmlns:a="http://schemas.openxmlformats.org/drawingml/2006/main" name="Office Theme">
   <a:themeElements>
-    <a:clrScheme name="LibreOffice">
+    <a:clrScheme name="Office">
       <a:dk1>
-        <a:srgbClr val="000000"/>
+        <a:sysClr val="windowText" lastClr="000000"/>
       </a:dk1>
       <a:lt1>
-        <a:srgbClr val="ffffff"/>
+        <a:sysClr val="window" lastClr="FFFFFF"/>
       </a:lt1>
       <a:dk2>
-        <a:srgbClr val="000000"/>
+        <a:srgbClr val="1F497D"/>
       </a:dk2>
       <a:lt2>
-        <a:srgbClr val="ffffff"/>
+        <a:srgbClr val="EEECE1"/>
       </a:lt2>
       <a:accent1>
-        <a:srgbClr val="18a303"/>
+        <a:srgbClr val="4F81BD"/>
       </a:accent1>
       <a:accent2>
-        <a:srgbClr val="0369a3"/>
+        <a:srgbClr val="C0504D"/>
       </a:accent2>
       <a:accent3>
-        <a:srgbClr val="a33e03"/>
+        <a:srgbClr val="9BBB59"/>
       </a:accent3>
       <a:accent4>
-        <a:srgbClr val="8e03a3"/>
+        <a:srgbClr val="8064A2"/>
       </a:accent4>
       <a:accent5>
-        <a:srgbClr val="c99c00"/>
+        <a:srgbClr val="4BACC6"/>
       </a:accent5>
       <a:accent6>
-        <a:srgbClr val="c9211e"/>
+        <a:srgbClr val="F79646"/>
       </a:accent6>
       <a:hlink>
-        <a:srgbClr val="0000ee"/>
+        <a:srgbClr val="0000FF"/>
       </a:hlink>
       <a:folHlink>
-        <a:srgbClr val="551a8b"/>
+        <a:srgbClr val="800080"/>
       </a:folHlink>
     </a:clrScheme>
     <a:fontScheme name="Office">
       <a:majorFont>
-        <a:latin typeface="Arial" pitchFamily="0" charset="1"/>
-        <a:ea typeface="DejaVu Sans" pitchFamily="0" charset="1"/>
-        <a:cs typeface="DejaVu Sans" pitchFamily="0" charset="1"/>
+        <a:latin typeface="Calibri"/>
+        <a:ea typeface=""/>
+        <a:cs typeface=""/>
+        <a:font script="Jpan" typeface="ＭＳ ゴシック"/>
+        <a:font script="Hang" typeface="맑은 고딕"/>
+        <a:font script="Hans" typeface="宋体"/>
+        <a:font script="Hant" typeface="新細明體"/>
+        <a:font script="Arab" typeface="Times New Roman"/>
+        <a:font script="Hebr" typeface="Times New Roman"/>
+        <a:font script="Thai" typeface="Angsana New"/>
+        <a:font script="Ethi" typeface="Nyala"/>
+        <a:font script="Beng" typeface="Vrinda"/>
+        <a:font script="Gujr" typeface="Shruti"/>
+        <a:font script="Khmr" typeface="MoolBoran"/>
+        <a:font script="Knda" typeface="Tunga"/>
+        <a:font script="Guru" typeface="Raavi"/>
+        <a:font script="Cans" typeface="Euphemia"/>
+        <a:font script="Cher" typeface="Plantagenet Cherokee"/>
+        <a:font script="Yiii" typeface="Microsoft Yi Baiti"/>
+        <a:font script="Tibt" typeface="Microsoft Himalaya"/>
+        <a:font script="Thaa" typeface="MV Boli"/>
+        <a:font script="Deva" typeface="Mangal"/>
+        <a:font script="Telu" typeface="Gautami"/>
+        <a:font script="Taml" typeface="Latha"/>
+        <a:font script="Syrc" typeface="Estrangelo Edessa"/>
+        <a:font script="Orya" typeface="Kalinga"/>
+        <a:font script="Mlym" typeface="Kartika"/>
+        <a:font script="Laoo" typeface="DokChampa"/>
+        <a:font script="Sinh" typeface="Iskoola Pota"/>
+        <a:font script="Mong" typeface="Mongolian Baiti"/>
+        <a:font script="Viet" typeface="Times New Roman"/>
+        <a:font script="Uigh" typeface="Microsoft Uighur"/>
       </a:majorFont>
       <a:minorFont>
-        <a:latin typeface="Arial" pitchFamily="0" charset="1"/>
-        <a:ea typeface="DejaVu Sans" pitchFamily="0" charset="1"/>
-        <a:cs typeface="DejaVu Sans" pitchFamily="0" charset="1"/>
+        <a:latin typeface="Cambria"/>
+        <a:ea typeface=""/>
+        <a:cs typeface=""/>
+        <a:font script="Jpan" typeface="ＭＳ 明朝"/>
+        <a:font script="Hang" typeface="맑은 고딕"/>
+        <a:font script="Hans" typeface="宋体"/>
+        <a:font script="Hant" typeface="新細明體"/>
+        <a:font script="Arab" typeface="Arial"/>
+        <a:font script="Hebr" typeface="Arial"/>
+        <a:font script="Thai" typeface="Cordia New"/>
+        <a:font script="Ethi" typeface="Nyala"/>
+        <a:font script="Beng" typeface="Vrinda"/>
+        <a:font script="Gujr" typeface="Shruti"/>
+        <a:font script="Khmr" typeface="DaunPenh"/>
+        <a:font script="Knda" typeface="Tunga"/>
+        <a:font script="Guru" typeface="Raavi"/>
+        <a:font script="Cans" typeface="Euphemia"/>
+        <a:font script="Cher" typeface="Plantagenet Cherokee"/>
+        <a:font script="Yiii" typeface="Microsoft Yi Baiti"/>
+        <a:font script="Tibt" typeface="Microsoft Himalaya"/>
+        <a:font script="Thaa" typeface="MV Boli"/>
+        <a:font script="Deva" typeface="Mangal"/>
+        <a:font script="Telu" typeface="Gautami"/>
+        <a:font script="Taml" typeface="Latha"/>
+        <a:font script="Syrc" typeface="Estrangelo Edessa"/>
+        <a:font script="Orya" typeface="Kalinga"/>
+        <a:font script="Mlym" typeface="Kartika"/>
+        <a:font script="Laoo" typeface="DokChampa"/>
+        <a:font script="Sinh" typeface="Iskoola Pota"/>
+        <a:font script="Mong" typeface="Mongolian Baiti"/>
+        <a:font script="Viet" typeface="Arial"/>
+        <a:font script="Uigh" typeface="Microsoft Uighur"/>
       </a:minorFont>
     </a:fontScheme>
-    <a:fmtScheme>
+    <a:fmtScheme name="Office">
       <a:fillStyleLst>
         <a:solidFill>
           <a:schemeClr val="phClr"/>
         </a:solidFill>
-        <a:solidFill>
-          <a:schemeClr val="phClr"/>
-        </a:solidFill>
-        <a:solidFill>
-          <a:schemeClr val="phClr"/>
-        </a:solidFill>
+        <a:gradFill rotWithShape="1">
+          <a:gsLst>
+            <a:gs pos="0">
+              <a:schemeClr val="phClr">
+                <a:tint val="50000"/>
+                <a:satMod val="300000"/>
+              </a:schemeClr>
+            </a:gs>
+            <a:gs pos="35000">
+              <a:schemeClr val="phClr">
+                <a:tint val="37000"/>
+                <a:satMod val="300000"/>
+              </a:schemeClr>
+            </a:gs>
+            <a:gs pos="100000">
+              <a:schemeClr val="phClr">
+                <a:tint val="15000"/>
+                <a:satMod val="350000"/>
+              </a:schemeClr>
+            </a:gs>
+          </a:gsLst>
+          <a:lin ang="16200000" scaled="1"/>
+        </a:gradFill>
+        <a:gradFill rotWithShape="1">
+          <a:gsLst>
+            <a:gs pos="0">
+              <a:schemeClr val="phClr">
+                <a:tint val="100000"/>
+                <a:shade val="100000"/>
+                <a:satMod val="130000"/>
+              </a:schemeClr>
+            </a:gs>
+            <a:gs pos="100000">
+              <a:schemeClr val="phClr">
+                <a:tint val="50000"/>
+                <a:shade val="100000"/>
+                <a:satMod val="350000"/>
+              </a:schemeClr>
+            </a:gs>
+          </a:gsLst>
+          <a:lin ang="16200000" scaled="0"/>
+        </a:gradFill>
       </a:fillStyleLst>
       <a:lnStyleLst>
-        <a:ln w="6350" cap="flat" cmpd="sng" algn="ctr">
+        <a:ln w="9525" cap="flat" cmpd="sng" algn="ctr">
+          <a:solidFill>
+            <a:schemeClr val="phClr">
+              <a:shade val="95000"/>
+              <a:satMod val="105000"/>
+            </a:schemeClr>
+          </a:solidFill>
           <a:prstDash val="solid"/>
-          <a:miter/>
         </a:ln>
-        <a:ln w="6350" cap="flat" cmpd="sng" algn="ctr">
+        <a:ln w="25400" cap="flat" cmpd="sng" algn="ctr">
+          <a:solidFill>
+            <a:schemeClr val="phClr"/>
+          </a:solidFill>
           <a:prstDash val="solid"/>
-          <a:miter/>
         </a:ln>
-        <a:ln w="6350" cap="flat" cmpd="sng" algn="ctr">
+        <a:ln w="38100" cap="flat" cmpd="sng" algn="ctr">
+          <a:solidFill>
+            <a:schemeClr val="phClr"/>
+          </a:solidFill>
           <a:prstDash val="solid"/>
-          <a:miter/>
         </a:ln>
       </a:lnStyleLst>
       <a:effectStyleLst>
         <a:effectStyle>
-          <a:effectLst/>
+          <a:effectLst>
+            <a:outerShdw blurRad="40000" dist="20000" dir="5400000" rotWithShape="0">
+              <a:srgbClr val="000000">
+                <a:alpha val="38000"/>
+              </a:srgbClr>
+            </a:outerShdw>
+          </a:effectLst>
         </a:effectStyle>
         <a:effectStyle>
-          <a:effectLst/>
+          <a:effectLst>
+            <a:outerShdw blurRad="40000" dist="23000" dir="5400000" rotWithShape="0">
+              <a:srgbClr val="000000">
+                <a:alpha val="35000"/>
+              </a:srgbClr>
+            </a:outerShdw>
+          </a:effectLst>
         </a:effectStyle>
         <a:effectStyle>
-          <a:effectLst/>
+          <a:effectLst>
+            <a:outerShdw blurRad="40000" dist="23000" dir="5400000" rotWithShape="0">
+              <a:srgbClr val="000000">
+                <a:alpha val="35000"/>
+              </a:srgbClr>
+            </a:outerShdw>
+          </a:effectLst>
+          <a:scene3d>
+            <a:camera prst="orthographicFront">
+              <a:rot lat="0" lon="0" rev="0"/>
+            </a:camera>
+            <a:lightRig rig="threePt" dir="t">
+              <a:rot lat="0" lon="0" rev="1200000"/>
+            </a:lightRig>
+          </a:scene3d>
+          <a:sp3d>
+            <a:bevelT w="63500" h="25400"/>
+          </a:sp3d>
         </a:effectStyle>
       </a:effectStyleLst>
       <a:bgFillStyleLst>
         <a:solidFill>
           <a:schemeClr val="phClr"/>
         </a:solidFill>
-        <a:solidFill>
-          <a:schemeClr val="phClr"/>
-        </a:solidFill>
-        <a:solidFill>
-          <a:schemeClr val="phClr"/>
-        </a:solidFill>
+        <a:gradFill rotWithShape="1">
+          <a:gsLst>
+            <a:gs pos="0">
+              <a:schemeClr val="phClr">
+                <a:tint val="40000"/>
+                <a:satMod val="350000"/>
+              </a:schemeClr>
+            </a:gs>
+            <a:gs pos="40000">
+              <a:schemeClr val="phClr">
+                <a:tint val="45000"/>
+                <a:shade val="99000"/>
+                <a:satMod val="350000"/>
+              </a:schemeClr>
+            </a:gs>
+            <a:gs pos="100000">
+              <a:schemeClr val="phClr">
+                <a:shade val="20000"/>
+                <a:satMod val="255000"/>
+              </a:schemeClr>
+            </a:gs>
+          </a:gsLst>
+          <a:path path="circle">
+            <a:fillToRect l="50000" t="-80000" r="50000" b="180000"/>
+          </a:path>
+        </a:gradFill>
+        <a:gradFill rotWithShape="1">
+          <a:gsLst>
+            <a:gs pos="0">
+              <a:schemeClr val="phClr">
+                <a:tint val="80000"/>
+                <a:satMod val="300000"/>
+              </a:schemeClr>
+            </a:gs>
+            <a:gs pos="100000">
+              <a:schemeClr val="phClr">
+                <a:shade val="30000"/>
+                <a:satMod val="200000"/>
+              </a:schemeClr>
+            </a:gs>
+          </a:gsLst>
+          <a:path path="circle">
+            <a:fillToRect l="50000" t="50000" r="50000" b="50000"/>
+          </a:path>
+        </a:gradFill>
       </a:bgFillStyleLst>
     </a:fmtScheme>
   </a:themeElements>
+  <a:objectDefaults>
+    <a:spDef>
+      <a:spPr/>
+      <a:bodyPr/>
+      <a:lstStyle/>
+      <a:style>
+        <a:lnRef idx="1">
+          <a:schemeClr val="accent1"/>
+        </a:lnRef>
+        <a:fillRef idx="3">
+          <a:schemeClr val="accent1"/>
+        </a:fillRef>
+        <a:effectRef idx="2">
+          <a:schemeClr val="accent1"/>
+        </a:effectRef>
+        <a:fontRef idx="minor">
+          <a:schemeClr val="lt1"/>
+        </a:fontRef>
+      </a:style>
+    </a:spDef>
+    <a:lnDef>
+      <a:spPr/>
+      <a:bodyPr/>
+      <a:lstStyle/>
+      <a:style>
+        <a:lnRef idx="2">
+          <a:schemeClr val="accent1"/>
+        </a:lnRef>
+        <a:fillRef idx="0">
+          <a:schemeClr val="accent1"/>
+        </a:fillRef>
+        <a:effectRef idx="1">
+          <a:schemeClr val="accent1"/>
+        </a:effectRef>
+        <a:fontRef idx="minor">
+          <a:schemeClr val="tx1"/>
+        </a:fontRef>
+      </a:style>
+    </a:lnDef>
+  </a:objectDefaults>
+  <a:extraClrSchemeLst/>
 </a:theme>
 </file>
</xml_diff>

<commit_message>
FSD v0.5 docx: v0.3 stijlen + Compact stijl toegevoegd
Co-Authored-By: Claude Sonnet 4.6 <noreply@anthropic.com>
</commit_message>
<xml_diff>
--- a/docs/FSD_LoRa_tuinmeetnet_v0_5.docx
+++ b/docs/FSD_LoRa_tuinmeetnet_v0_5.docx
@@ -11703,13 +11703,7 @@
     </w:p>
     <w:bookmarkEnd w:id="60"/>
     <w:bookmarkEnd w:id="61"/>
-    <w:sectPr>
-      <w:footerReference r:id="rId9" w:type="default"/>
-      <w:pgSz w:h="15840" w:w="12240"/>
-      <w:pgMar w:bottom="1008" w:footer="720" w:gutter="0" w:header="720" w:left="1152" w:right="1152" w:top="1080"/>
-      <w:cols w:space="720"/>
-      <w:docGrid w:linePitch="360"/>
-    </w:sectPr>
+    <w:sectPr/>
   </w:body>
 </w:document>
 </file>
@@ -11718,20 +11712,6 @@
 <w:comments xmlns:w="http://schemas.openxmlformats.org/wordprocessingml/2006/main" xmlns:m="http://schemas.openxmlformats.org/officeDocument/2006/math" xmlns:r="http://schemas.openxmlformats.org/officeDocument/2006/relationships" xmlns:o="urn:schemas-microsoft-com:office:office" xmlns:v="urn:schemas-microsoft-com:vml" xmlns:w10="urn:schemas-microsoft-com:office:word" xmlns:a="http://schemas.openxmlformats.org/drawingml/2006/main" xmlns:pic="http://schemas.openxmlformats.org/drawingml/2006/picture" xmlns:wp="http://schemas.openxmlformats.org/drawingml/2006/wordprocessingDrawing"/>
 </file>
 
-<file path=word/footer1.xml><?xml version="1.0" encoding="utf-8"?>
-<w:ftr xmlns:m="http://schemas.openxmlformats.org/officeDocument/2006/math" xmlns:mc="http://schemas.openxmlformats.org/markup-compatibility/2006" xmlns:mo="http://schemas.microsoft.com/office/mac/office/2008/main" xmlns:mv="urn:schemas-microsoft-com:mac:vml" xmlns:o="urn:schemas-microsoft-com:office:office" xmlns:r="http://schemas.openxmlformats.org/officeDocument/2006/relationships" xmlns:v="urn:schemas-microsoft-com:vml" xmlns:w10="urn:schemas-microsoft-com:office:word" xmlns:w14="http://schemas.microsoft.com/office/word/2010/wordml" xmlns:w="http://schemas.openxmlformats.org/wordprocessingml/2006/main" xmlns:wne="http://schemas.microsoft.com/office/word/2006/wordml" xmlns:wp14="http://schemas.microsoft.com/office/word/2010/wordprocessingDrawing" xmlns:wp="http://schemas.openxmlformats.org/drawingml/2006/wordprocessingDrawing" xmlns:wpc="http://schemas.microsoft.com/office/word/2010/wordprocessingCanvas" xmlns:wpg="http://schemas.microsoft.com/office/word/2010/wordprocessingGroup" xmlns:wpi="http://schemas.microsoft.com/office/word/2010/wordprocessingInk" xmlns:wps="http://schemas.microsoft.com/office/word/2010/wordprocessingShape" mc:Ignorable="w14 wp14">
-  <w:p>
-    <w:pPr>
-      <w:pStyle w:val="Footer"/>
-      <w:jc w:val="right"/>
-    </w:pPr>
-    <w:r>
-      <w:t>LoRa tuinmeetnet FSD v0.3</w:t>
-    </w:r>
-  </w:p>
-</w:ftr>
-</file>
-
 <file path=word/footnotes.xml><?xml version="1.0" encoding="utf-8"?>
 <w:footnotes xmlns:w="http://schemas.openxmlformats.org/wordprocessingml/2006/main" xmlns:m="http://schemas.openxmlformats.org/officeDocument/2006/math" xmlns:r="http://schemas.openxmlformats.org/officeDocument/2006/relationships" xmlns:o="urn:schemas-microsoft-com:office:office" xmlns:v="urn:schemas-microsoft-com:vml" xmlns:w10="urn:schemas-microsoft-com:office:word" xmlns:a="http://schemas.openxmlformats.org/drawingml/2006/main" xmlns:pic="http://schemas.openxmlformats.org/drawingml/2006/picture" xmlns:wp="http://schemas.openxmlformats.org/drawingml/2006/wordprocessingDrawing">
   <w:footnote w:type="continuationSeparator" w:id="0">
@@ -11752,178 +11732,7 @@
 </file>
 
 <file path=word/numbering.xml><?xml version="1.0" encoding="utf-8"?>
-<w:numbering xmlns:m="http://schemas.openxmlformats.org/officeDocument/2006/math" xmlns:mc="http://schemas.openxmlformats.org/markup-compatibility/2006" xmlns:mo="http://schemas.microsoft.com/office/mac/office/2008/main" xmlns:mv="urn:schemas-microsoft-com:mac:vml" xmlns:o="urn:schemas-microsoft-com:office:office" xmlns:r="http://schemas.openxmlformats.org/officeDocument/2006/relationships" xmlns:v="urn:schemas-microsoft-com:vml" xmlns:w="http://schemas.openxmlformats.org/wordprocessingml/2006/main" xmlns:w10="urn:schemas-microsoft-com:office:word" xmlns:w14="http://schemas.microsoft.com/office/word/2010/wordml" xmlns:wne="http://schemas.microsoft.com/office/word/2006/wordml" xmlns:wp="http://schemas.openxmlformats.org/drawingml/2006/wordprocessingDrawing" xmlns:wp14="http://schemas.microsoft.com/office/word/2010/wordprocessingDrawing" xmlns:wpc="http://schemas.microsoft.com/office/word/2010/wordprocessingCanvas" xmlns:wpg="http://schemas.microsoft.com/office/word/2010/wordprocessingGroup" xmlns:wpi="http://schemas.microsoft.com/office/word/2010/wordprocessingInk" xmlns:wps="http://schemas.microsoft.com/office/word/2010/wordprocessingShape" mc:Ignorable="w14 wp14">
-  <w:abstractNum w:abstractNumId="0">
-    <w:nsid w:val="FFFFFF7C"/>
-    <w:multiLevelType w:val="singleLevel"/>
-    <w:tmpl w:val="C310EC42"/>
-    <w:lvl w:ilvl="0">
-      <w:start w:val="1"/>
-      <w:numFmt w:val="decimal"/>
-      <w:lvlText w:val="%1."/>
-      <w:lvlJc w:val="left"/>
-      <w:pPr>
-        <w:tabs>
-          <w:tab w:pos="1800" w:val="num"/>
-        </w:tabs>
-        <w:ind w:hanging="360" w:left="1800"/>
-      </w:pPr>
-    </w:lvl>
-  </w:abstractNum>
-  <w:abstractNum w:abstractNumId="1">
-    <w:nsid w:val="FFFFFF7D"/>
-    <w:multiLevelType w:val="singleLevel"/>
-    <w:tmpl w:val="E4089024"/>
-    <w:lvl w:ilvl="0">
-      <w:start w:val="1"/>
-      <w:numFmt w:val="decimal"/>
-      <w:lvlText w:val="%1."/>
-      <w:lvlJc w:val="left"/>
-      <w:pPr>
-        <w:tabs>
-          <w:tab w:pos="1440" w:val="num"/>
-        </w:tabs>
-        <w:ind w:hanging="360" w:left="1440"/>
-      </w:pPr>
-    </w:lvl>
-  </w:abstractNum>
-  <w:abstractNum w:abstractNumId="2">
-    <w:nsid w:val="FFFFFF7E"/>
-    <w:multiLevelType w:val="singleLevel"/>
-    <w:tmpl w:val="FB12693A"/>
-    <w:lvl w:ilvl="0">
-      <w:start w:val="1"/>
-      <w:numFmt w:val="decimal"/>
-      <w:pStyle w:val="ListNumber3"/>
-      <w:lvlText w:val="%1."/>
-      <w:lvlJc w:val="left"/>
-      <w:pPr>
-        <w:tabs>
-          <w:tab w:pos="1080" w:val="num"/>
-        </w:tabs>
-        <w:ind w:hanging="360" w:left="1080"/>
-      </w:pPr>
-    </w:lvl>
-  </w:abstractNum>
-  <w:abstractNum w:abstractNumId="3">
-    <w:nsid w:val="FFFFFF7F"/>
-    <w:multiLevelType w:val="singleLevel"/>
-    <w:tmpl w:val="38441652"/>
-    <w:lvl w:ilvl="0">
-      <w:start w:val="1"/>
-      <w:numFmt w:val="decimal"/>
-      <w:pStyle w:val="ListNumber2"/>
-      <w:lvlText w:val="%1."/>
-      <w:lvlJc w:val="left"/>
-      <w:pPr>
-        <w:tabs>
-          <w:tab w:pos="720" w:val="num"/>
-        </w:tabs>
-        <w:ind w:hanging="360" w:left="720"/>
-      </w:pPr>
-    </w:lvl>
-  </w:abstractNum>
-  <w:abstractNum w:abstractNumId="4">
-    <w:nsid w:val="FFFFFF81"/>
-    <w:multiLevelType w:val="singleLevel"/>
-    <w:tmpl w:val="171AC3A4"/>
-    <w:lvl w:ilvl="0">
-      <w:start w:val="1"/>
-      <w:numFmt w:val="bullet"/>
-      <w:lvlText w:val=""/>
-      <w:lvlJc w:val="left"/>
-      <w:pPr>
-        <w:tabs>
-          <w:tab w:pos="1440" w:val="num"/>
-        </w:tabs>
-        <w:ind w:hanging="360" w:left="1440"/>
-      </w:pPr>
-      <w:rPr>
-        <w:rFonts w:ascii="Symbol" w:hAnsi="Symbol" w:hint="default"/>
-      </w:rPr>
-    </w:lvl>
-  </w:abstractNum>
-  <w:abstractNum w:abstractNumId="5">
-    <w:nsid w:val="FFFFFF82"/>
-    <w:multiLevelType w:val="singleLevel"/>
-    <w:tmpl w:val="F3EAFDEC"/>
-    <w:lvl w:ilvl="0">
-      <w:start w:val="1"/>
-      <w:numFmt w:val="bullet"/>
-      <w:pStyle w:val="ListBullet3"/>
-      <w:lvlText w:val=""/>
-      <w:lvlJc w:val="left"/>
-      <w:pPr>
-        <w:tabs>
-          <w:tab w:pos="1080" w:val="num"/>
-        </w:tabs>
-        <w:ind w:hanging="360" w:left="1080"/>
-      </w:pPr>
-      <w:rPr>
-        <w:rFonts w:ascii="Symbol" w:hAnsi="Symbol" w:hint="default"/>
-      </w:rPr>
-    </w:lvl>
-  </w:abstractNum>
-  <w:abstractNum w:abstractNumId="6">
-    <w:nsid w:val="FFFFFF83"/>
-    <w:multiLevelType w:val="singleLevel"/>
-    <w:tmpl w:val="3D1EFFD4"/>
-    <w:lvl w:ilvl="0">
-      <w:start w:val="1"/>
-      <w:numFmt w:val="bullet"/>
-      <w:pStyle w:val="ListBullet2"/>
-      <w:lvlText w:val=""/>
-      <w:lvlJc w:val="left"/>
-      <w:pPr>
-        <w:tabs>
-          <w:tab w:pos="720" w:val="num"/>
-        </w:tabs>
-        <w:ind w:hanging="360" w:left="720"/>
-      </w:pPr>
-      <w:rPr>
-        <w:rFonts w:ascii="Symbol" w:hAnsi="Symbol" w:hint="default"/>
-      </w:rPr>
-    </w:lvl>
-  </w:abstractNum>
-  <w:abstractNum w:abstractNumId="7">
-    <w:nsid w:val="FFFFFF88"/>
-    <w:multiLevelType w:val="singleLevel"/>
-    <w:tmpl w:val="D0A62B40"/>
-    <w:lvl w:ilvl="0">
-      <w:start w:val="1"/>
-      <w:numFmt w:val="decimal"/>
-      <w:pStyle w:val="ListNumber"/>
-      <w:lvlText w:val="%1."/>
-      <w:lvlJc w:val="left"/>
-      <w:pPr>
-        <w:tabs>
-          <w:tab w:pos="360" w:val="num"/>
-        </w:tabs>
-        <w:ind w:hanging="360" w:left="360"/>
-      </w:pPr>
-    </w:lvl>
-  </w:abstractNum>
-  <w:abstractNum w:abstractNumId="8">
-    <w:nsid w:val="FFFFFF89"/>
-    <w:multiLevelType w:val="singleLevel"/>
-    <w:tmpl w:val="29761A62"/>
-    <w:lvl w:ilvl="0">
-      <w:start w:val="1"/>
-      <w:numFmt w:val="bullet"/>
-      <w:pStyle w:val="ListBullet"/>
-      <w:lvlText w:val=""/>
-      <w:lvlJc w:val="left"/>
-      <w:pPr>
-        <w:tabs>
-          <w:tab w:pos="360" w:val="num"/>
-        </w:tabs>
-        <w:ind w:hanging="360" w:left="360"/>
-      </w:pPr>
-      <w:rPr>
-        <w:rFonts w:ascii="Symbol" w:hAnsi="Symbol" w:hint="default"/>
-      </w:rPr>
-    </w:lvl>
-  </w:abstractNum>
+<w:numbering xmlns:w="http://schemas.openxmlformats.org/wordprocessingml/2006/main">
   <w:abstractNum w:abstractNumId="990">
     <w:nsid w:val="A990"/>
     <w:multiLevelType w:val="multilevel"/>
@@ -12161,33 +11970,6 @@
       </w:pPr>
     </w:lvl>
   </w:abstractNum>
-  <w:num w:numId="1">
-    <w:abstractNumId w:val="8"/>
-  </w:num>
-  <w:num w:numId="2">
-    <w:abstractNumId w:val="6"/>
-  </w:num>
-  <w:num w:numId="3">
-    <w:abstractNumId w:val="5"/>
-  </w:num>
-  <w:num w:numId="4">
-    <w:abstractNumId w:val="4"/>
-  </w:num>
-  <w:num w:numId="5">
-    <w:abstractNumId w:val="7"/>
-  </w:num>
-  <w:num w:numId="6">
-    <w:abstractNumId w:val="3"/>
-  </w:num>
-  <w:num w:numId="7">
-    <w:abstractNumId w:val="2"/>
-  </w:num>
-  <w:num w:numId="8">
-    <w:abstractNumId w:val="1"/>
-  </w:num>
-  <w:num w:numId="9">
-    <w:abstractNumId w:val="0"/>
-  </w:num>
   <w:num w:numId="1000">
     <w:abstractNumId w:val="990"/>
   </w:num>
@@ -24228,6 +24010,13 @@
       </w:tcPr>
     </w:tblStylePr>
   </w:style>
+  <w:style w:styleId="Compact" w:type="paragraph">
+    <w:name w:val="Compact"/>
+    <w:basedOn w:val="Normal"/>
+    <w:pPr>
+      <w:spacing w:after="0" w:line="240" w:lineRule="auto"/>
+    </w:pPr>
+  </w:style>
   <w:style w:type="paragraph" w:customStyle="1" w:styleId="SourceCode">
     <w:name w:val="Source Code"/>
     <w:basedOn w:val="Normal"/>
@@ -24540,7 +24329,6 @@
         <a:font script="Mong" typeface="Mongolian Baiti"/>
         <a:font script="Viet" typeface="Times New Roman"/>
         <a:font script="Uigh" typeface="Microsoft Uighur"/>
-        <a:font script="Geor" typeface="Sylfaen"/>
       </a:majorFont>
       <a:minorFont>
         <a:latin typeface="Cambria"/>
@@ -24575,7 +24363,6 @@
         <a:font script="Mong" typeface="Mongolian Baiti"/>
         <a:font script="Viet" typeface="Arial"/>
         <a:font script="Uigh" typeface="Microsoft Uighur"/>
-        <a:font script="Geor" typeface="Sylfaen"/>
       </a:minorFont>
     </a:fontScheme>
     <a:fmtScheme name="Office">

</xml_diff>